<commit_message>
added bootstrap to my code
</commit_message>
<xml_diff>
--- a/WMD Assignment Part A .docx
+++ b/WMD Assignment Part A .docx
@@ -497,7 +497,6 @@
           <w:b/>
         </w:rPr>
       </w:pPr>
-      <w:proofErr w:type="spellStart"/>
       <w:r>
         <w:rPr>
           <w:rFonts w:ascii="Century Gothic" w:eastAsia="Century Gothic" w:hAnsi="Century Gothic" w:cs="Century Gothic"/>
@@ -505,17 +504,7 @@
           <w:bCs/>
           <w:lang w:val="en-US"/>
         </w:rPr>
-        <w:t>Programme</w:t>
-      </w:r>
-      <w:proofErr w:type="spellEnd"/>
-      <w:r>
-        <w:rPr>
-          <w:rFonts w:ascii="Century Gothic" w:eastAsia="Century Gothic" w:hAnsi="Century Gothic" w:cs="Century Gothic"/>
-          <w:b/>
-          <w:bCs/>
-          <w:lang w:val="en-US"/>
-        </w:rPr>
-        <w:t xml:space="preserve"> of Study</w:t>
+        <w:t>Programme of Study</w:t>
       </w:r>
       <w:r>
         <w:rPr>
@@ -696,8 +685,6 @@
         </w:rPr>
         <w:t>………</w:t>
       </w:r>
-      <w:proofErr w:type="spellStart"/>
-      <w:proofErr w:type="gramStart"/>
       <w:r>
         <w:rPr>
           <w:rFonts w:asciiTheme="minorHAnsi" w:eastAsiaTheme="minorEastAsia" w:hAnsiTheme="minorHAnsi" w:cstheme="minorBidi"/>
@@ -706,8 +693,6 @@
         </w:rPr>
         <w:t>T.Relaeng</w:t>
       </w:r>
-      <w:proofErr w:type="spellEnd"/>
-      <w:proofErr w:type="gramEnd"/>
       <w:r>
         <w:rPr>
           <w:rFonts w:asciiTheme="minorHAnsi" w:eastAsiaTheme="minorEastAsia" w:hAnsiTheme="minorHAnsi" w:cstheme="minorBidi"/>
@@ -956,21 +941,7 @@
         <w:rPr>
           <w:sz w:val="24"/>
         </w:rPr>
-        <w:t xml:space="preserve">offering stylish and </w:t>
-      </w:r>
-      <w:proofErr w:type="gramStart"/>
-      <w:r>
-        <w:rPr>
-          <w:sz w:val="24"/>
-        </w:rPr>
-        <w:t>high quality</w:t>
-      </w:r>
-      <w:proofErr w:type="gramEnd"/>
-      <w:r>
-        <w:rPr>
-          <w:sz w:val="24"/>
-        </w:rPr>
-        <w:t xml:space="preserve"> </w:t>
+        <w:t xml:space="preserve">offering stylish and high quality </w:t>
       </w:r>
       <w:r>
         <w:rPr>
@@ -988,35 +959,13 @@
         <w:rPr>
           <w:sz w:val="24"/>
         </w:rPr>
-        <w:t xml:space="preserve"> </w:t>
-      </w:r>
-      <w:proofErr w:type="gramStart"/>
-      <w:r>
-        <w:rPr>
-          <w:sz w:val="24"/>
-        </w:rPr>
-        <w:t>a</w:t>
-      </w:r>
-      <w:proofErr w:type="gramEnd"/>
-      <w:r>
-        <w:rPr>
-          <w:sz w:val="24"/>
-        </w:rPr>
-        <w:t xml:space="preserve"> engaging and </w:t>
-      </w:r>
-      <w:proofErr w:type="gramStart"/>
-      <w:r>
-        <w:rPr>
-          <w:sz w:val="24"/>
-        </w:rPr>
-        <w:t>user friendly</w:t>
-      </w:r>
-      <w:proofErr w:type="gramEnd"/>
-      <w:r>
-        <w:rPr>
-          <w:sz w:val="24"/>
-        </w:rPr>
-        <w:t xml:space="preserve"> platform that allows customers to view, explore and purchase products </w:t>
+        <w:t xml:space="preserve"> a</w:t>
+      </w:r>
+      <w:r>
+        <w:rPr>
+          <w:sz w:val="24"/>
+        </w:rPr>
+        <w:t xml:space="preserve"> engaging and user friendly platform that allows customers to view, explore and purchase products </w:t>
       </w:r>
       <w:r>
         <w:rPr>
@@ -1097,35 +1046,7 @@
         <w:rPr>
           <w:sz w:val="24"/>
         </w:rPr>
-        <w:t xml:space="preserve">The website </w:t>
-      </w:r>
-      <w:proofErr w:type="gramStart"/>
-      <w:r>
-        <w:rPr>
-          <w:sz w:val="24"/>
-        </w:rPr>
-        <w:t>is</w:t>
-      </w:r>
-      <w:proofErr w:type="gramEnd"/>
-      <w:r>
-        <w:rPr>
-          <w:sz w:val="24"/>
-        </w:rPr>
-        <w:t xml:space="preserve"> created to show </w:t>
-      </w:r>
-      <w:proofErr w:type="gramStart"/>
-      <w:r>
-        <w:rPr>
-          <w:sz w:val="24"/>
-        </w:rPr>
-        <w:t>the brand</w:t>
-      </w:r>
-      <w:proofErr w:type="gramEnd"/>
-      <w:r>
-        <w:rPr>
-          <w:sz w:val="24"/>
-        </w:rPr>
-        <w:t xml:space="preserve"> identity and make it more visible to customers as a reliable fashion brand. This helps to build more trust, attract and encourage customers to support and buy from Panda Paradise</w:t>
+        <w:t>The website is created to show the brand identity and make it more visible to customers as a reliable fashion brand. This helps to build more trust, attract and encourage customers to support and buy from Panda Paradise</w:t>
       </w:r>
       <w:r>
         <w:rPr>
@@ -1642,13 +1563,13 @@
         <w:rPr>
           <w:sz w:val="24"/>
         </w:rPr>
-        <w:t>7</w:t>
-      </w:r>
-      <w:r>
-        <w:rPr>
-          <w:sz w:val="24"/>
-        </w:rPr>
-        <w:t xml:space="preserve"> pages</w:t>
+        <w:t xml:space="preserve">9 </w:t>
+      </w:r>
+      <w:r>
+        <w:rPr>
+          <w:sz w:val="24"/>
+        </w:rPr>
+        <w:t>pages</w:t>
       </w:r>
       <w:r>
         <w:rPr>
@@ -1684,13 +1605,7 @@
         <w:rPr>
           <w:sz w:val="24"/>
         </w:rPr>
-        <w:t>Log-in(</w:t>
-      </w:r>
-      <w:r>
-        <w:rPr>
-          <w:sz w:val="24"/>
-        </w:rPr>
-        <w:t>login.html)</w:t>
+        <w:t>Landing page(index.html)</w:t>
       </w:r>
     </w:p>
     <w:p>
@@ -1704,13 +1619,19 @@
         <w:rPr>
           <w:sz w:val="24"/>
         </w:rPr>
-        <w:t>Sign-up(</w:t>
-      </w:r>
-      <w:r>
-        <w:rPr>
-          <w:sz w:val="24"/>
-        </w:rPr>
-        <w:t>signup.html)</w:t>
+        <w:t>Home(</w:t>
+      </w:r>
+      <w:r>
+        <w:rPr>
+          <w:sz w:val="24"/>
+        </w:rPr>
+        <w:t>home</w:t>
+      </w:r>
+      <w:r>
+        <w:rPr>
+          <w:sz w:val="24"/>
+        </w:rPr>
+        <w:t>.html)</w:t>
       </w:r>
     </w:p>
     <w:p>
@@ -1724,7 +1645,19 @@
         <w:rPr>
           <w:sz w:val="24"/>
         </w:rPr>
-        <w:t>Home(index.html)</w:t>
+        <w:t>About (</w:t>
+      </w:r>
+      <w:r>
+        <w:rPr>
+          <w:sz w:val="24"/>
+        </w:rPr>
+        <w:t>a</w:t>
+      </w:r>
+      <w:r>
+        <w:rPr>
+          <w:sz w:val="24"/>
+        </w:rPr>
+        <w:t>bout.html)</w:t>
       </w:r>
     </w:p>
     <w:p>
@@ -1738,19 +1671,7 @@
         <w:rPr>
           <w:sz w:val="24"/>
         </w:rPr>
-        <w:t>About (</w:t>
-      </w:r>
-      <w:r>
-        <w:rPr>
-          <w:sz w:val="24"/>
-        </w:rPr>
-        <w:t>a</w:t>
-      </w:r>
-      <w:r>
-        <w:rPr>
-          <w:sz w:val="24"/>
-        </w:rPr>
-        <w:t>bout.html)</w:t>
+        <w:t>Catalogue(catalogue.html)</w:t>
       </w:r>
     </w:p>
     <w:p>
@@ -1764,7 +1685,7 @@
         <w:rPr>
           <w:sz w:val="24"/>
         </w:rPr>
-        <w:t>Catalogue(catalogue.html)</w:t>
+        <w:t>Log-in(login.html)</w:t>
       </w:r>
     </w:p>
     <w:p>
@@ -1778,6 +1699,20 @@
         <w:rPr>
           <w:sz w:val="24"/>
         </w:rPr>
+        <w:t>Sign-up(signup.html)</w:t>
+      </w:r>
+    </w:p>
+    <w:p>
+      <w:pPr>
+        <w:pStyle w:val="ListParagraph"/>
+        <w:rPr>
+          <w:sz w:val="24"/>
+        </w:rPr>
+      </w:pPr>
+      <w:r>
+        <w:rPr>
+          <w:sz w:val="24"/>
+        </w:rPr>
         <w:t>Contact(contact.html)</w:t>
       </w:r>
     </w:p>
@@ -1869,10 +1804,10 @@
           <w:bCs/>
         </w:rPr>
         <w:drawing>
-          <wp:inline distT="0" distB="0" distL="0" distR="0" wp14:anchorId="7F59142B" wp14:editId="59F4484B">
-            <wp:extent cx="4601308" cy="2641529"/>
-            <wp:effectExtent l="0" t="0" r="0" b="6985"/>
-            <wp:docPr id="434030167" name="Picture 1"/>
+          <wp:inline distT="0" distB="0" distL="0" distR="0" wp14:anchorId="58AFD663" wp14:editId="7A7DC0F8">
+            <wp:extent cx="5570220" cy="3409315"/>
+            <wp:effectExtent l="0" t="0" r="0" b="635"/>
+            <wp:docPr id="666322286" name="Picture 1"/>
             <wp:cNvGraphicFramePr>
               <a:graphicFrameLocks xmlns:a="http://schemas.openxmlformats.org/drawingml/2006/main" noChangeAspect="1"/>
             </wp:cNvGraphicFramePr>
@@ -1880,12 +1815,972 @@
               <a:graphicData uri="http://schemas.openxmlformats.org/drawingml/2006/picture">
                 <pic:pic xmlns:pic="http://schemas.openxmlformats.org/drawingml/2006/picture">
                   <pic:nvPicPr>
-                    <pic:cNvPr id="434030167" name=""/>
+                    <pic:cNvPr id="666322286" name=""/>
+                    <pic:cNvPicPr/>
+                  </pic:nvPicPr>
+                  <pic:blipFill>
+                    <a:blip r:embed="rId7"/>
+                    <a:stretch>
+                      <a:fillRect/>
+                    </a:stretch>
+                  </pic:blipFill>
+                  <pic:spPr>
+                    <a:xfrm>
+                      <a:off x="0" y="0"/>
+                      <a:ext cx="5570220" cy="3409315"/>
+                    </a:xfrm>
+                    <a:prstGeom prst="rect">
+                      <a:avLst/>
+                    </a:prstGeom>
+                  </pic:spPr>
+                </pic:pic>
+              </a:graphicData>
+            </a:graphic>
+          </wp:inline>
+        </w:drawing>
+      </w:r>
+    </w:p>
+    <w:p>
+      <w:pPr>
+        <w:pStyle w:val="ListParagraph"/>
+        <w:rPr>
+          <w:b/>
+          <w:bCs/>
+        </w:rPr>
+      </w:pPr>
+    </w:p>
+    <w:p>
+      <w:r>
+        <w:rPr>
+          <w:b/>
+          <w:bCs/>
+        </w:rPr>
+        <w:t>Landing page:</w:t>
+      </w:r>
+      <w:r>
+        <w:rPr>
+          <w:b/>
+          <w:bCs/>
+        </w:rPr>
+        <w:t xml:space="preserve"> </w:t>
+      </w:r>
+      <w:r>
+        <w:t xml:space="preserve">This is the first page that customers </w:t>
+      </w:r>
+      <w:r>
+        <w:t xml:space="preserve">encounter when using Panda Paradise website. It calls them </w:t>
+      </w:r>
+      <w:r>
+        <w:t>to take</w:t>
+      </w:r>
+      <w:r>
+        <w:t xml:space="preserve"> </w:t>
+      </w:r>
+      <w:r>
+        <w:t>action</w:t>
+      </w:r>
+      <w:r>
+        <w:t xml:space="preserve"> by bei</w:t>
+      </w:r>
+    </w:p>
+    <w:p>
+      <w:pPr>
+        <w:rPr>
+          <w:sz w:val="24"/>
+        </w:rPr>
+      </w:pPr>
+      <w:r>
+        <w:rPr>
+          <w:b/>
+          <w:bCs/>
+          <w:sz w:val="24"/>
+        </w:rPr>
+        <w:t>S</w:t>
+      </w:r>
+      <w:r>
+        <w:rPr>
+          <w:b/>
+          <w:bCs/>
+          <w:sz w:val="24"/>
+        </w:rPr>
+        <w:t>ign-up</w:t>
+      </w:r>
+      <w:r>
+        <w:rPr>
+          <w:sz w:val="24"/>
+        </w:rPr>
+        <w:t xml:space="preserve">: This page will require the customer to input their email address </w:t>
+      </w:r>
+      <w:r>
+        <w:rPr>
+          <w:sz w:val="24"/>
+        </w:rPr>
+        <w:t xml:space="preserve">or phone number </w:t>
+      </w:r>
+      <w:r>
+        <w:rPr>
+          <w:sz w:val="24"/>
+        </w:rPr>
+        <w:t>as well at the password</w:t>
+      </w:r>
+      <w:r>
+        <w:rPr>
+          <w:sz w:val="24"/>
+        </w:rPr>
+        <w:t xml:space="preserve"> to gain access to the website and utilize it.</w:t>
+      </w:r>
+    </w:p>
+    <w:p>
+      <w:pPr>
+        <w:rPr>
+          <w:sz w:val="24"/>
+        </w:rPr>
+      </w:pPr>
+      <w:r>
+        <w:rPr>
+          <w:b/>
+          <w:bCs/>
+          <w:sz w:val="24"/>
+        </w:rPr>
+        <w:t>Log-in</w:t>
+      </w:r>
+      <w:r>
+        <w:rPr>
+          <w:sz w:val="24"/>
+        </w:rPr>
+        <w:t>:</w:t>
+      </w:r>
+      <w:r>
+        <w:rPr>
+          <w:sz w:val="24"/>
+        </w:rPr>
+        <w:t xml:space="preserve"> </w:t>
+      </w:r>
+      <w:r>
+        <w:rPr>
+          <w:sz w:val="24"/>
+        </w:rPr>
+        <w:t>It will authenticate</w:t>
+      </w:r>
+      <w:r>
+        <w:rPr>
+          <w:sz w:val="24"/>
+        </w:rPr>
+        <w:t xml:space="preserve"> by prompting users to input their details </w:t>
+      </w:r>
+      <w:r>
+        <w:rPr>
+          <w:sz w:val="24"/>
+        </w:rPr>
+        <w:t xml:space="preserve">so that only authorized people can </w:t>
+      </w:r>
+      <w:r>
+        <w:rPr>
+          <w:sz w:val="24"/>
+        </w:rPr>
+        <w:t>access their</w:t>
+      </w:r>
+      <w:r>
+        <w:rPr>
+          <w:sz w:val="24"/>
+        </w:rPr>
+        <w:t xml:space="preserve"> </w:t>
+      </w:r>
+      <w:r>
+        <w:rPr>
+          <w:sz w:val="24"/>
+        </w:rPr>
+        <w:t>accounts.</w:t>
+      </w:r>
+    </w:p>
+    <w:p>
+      <w:pPr>
+        <w:rPr>
+          <w:sz w:val="24"/>
+        </w:rPr>
+      </w:pPr>
+      <w:r>
+        <w:rPr>
+          <w:b/>
+          <w:bCs/>
+          <w:sz w:val="24"/>
+        </w:rPr>
+        <w:t>Home</w:t>
+      </w:r>
+      <w:r>
+        <w:rPr>
+          <w:sz w:val="24"/>
+        </w:rPr>
+        <w:t>:</w:t>
+      </w:r>
+      <w:r>
+        <w:rPr>
+          <w:sz w:val="24"/>
+        </w:rPr>
+        <w:t xml:space="preserve"> </w:t>
+      </w:r>
+      <w:r>
+        <w:rPr>
+          <w:sz w:val="24"/>
+        </w:rPr>
+        <w:t>T</w:t>
+      </w:r>
+      <w:r>
+        <w:rPr>
+          <w:sz w:val="24"/>
+        </w:rPr>
+        <w:t>he landing page has the welcoming message</w:t>
+      </w:r>
+      <w:r>
+        <w:rPr>
+          <w:sz w:val="24"/>
+        </w:rPr>
+        <w:t xml:space="preserve"> and a few products which have the </w:t>
+      </w:r>
+      <w:r>
+        <w:rPr>
+          <w:sz w:val="24"/>
+        </w:rPr>
+        <w:t xml:space="preserve">option </w:t>
+      </w:r>
+      <w:r>
+        <w:rPr>
+          <w:sz w:val="24"/>
+        </w:rPr>
+        <w:t xml:space="preserve">to shop now which leads to </w:t>
+      </w:r>
+      <w:r>
+        <w:rPr>
+          <w:sz w:val="24"/>
+        </w:rPr>
+        <w:t>catalogue. It also has the services provided by Panda Paradise</w:t>
+      </w:r>
+      <w:r>
+        <w:rPr>
+          <w:sz w:val="24"/>
+        </w:rPr>
+        <w:t xml:space="preserve"> and the footer containing </w:t>
+      </w:r>
+      <w:r>
+        <w:rPr>
+          <w:sz w:val="24"/>
+        </w:rPr>
+        <w:t xml:space="preserve">contact </w:t>
+      </w:r>
+      <w:r>
+        <w:rPr>
+          <w:sz w:val="24"/>
+        </w:rPr>
+        <w:t>information, location</w:t>
+      </w:r>
+      <w:r>
+        <w:rPr>
+          <w:sz w:val="24"/>
+        </w:rPr>
+        <w:t xml:space="preserve"> and social media </w:t>
+      </w:r>
+      <w:r>
+        <w:rPr>
+          <w:sz w:val="24"/>
+        </w:rPr>
+        <w:t>platforms. It also has all navigation.</w:t>
+      </w:r>
+    </w:p>
+    <w:p>
+      <w:pPr>
+        <w:rPr>
+          <w:sz w:val="24"/>
+        </w:rPr>
+      </w:pPr>
+      <w:r>
+        <w:rPr>
+          <w:b/>
+          <w:bCs/>
+          <w:sz w:val="24"/>
+        </w:rPr>
+        <w:t>About</w:t>
+      </w:r>
+      <w:r>
+        <w:rPr>
+          <w:sz w:val="24"/>
+        </w:rPr>
+        <w:t xml:space="preserve">: It </w:t>
+      </w:r>
+      <w:r>
+        <w:rPr>
+          <w:sz w:val="24"/>
+        </w:rPr>
+        <w:t xml:space="preserve">shows the </w:t>
+      </w:r>
+      <w:r>
+        <w:rPr>
+          <w:sz w:val="24"/>
+        </w:rPr>
+        <w:t xml:space="preserve">story of Panda Paradise </w:t>
+      </w:r>
+      <w:r>
+        <w:rPr>
+          <w:sz w:val="24"/>
+        </w:rPr>
+        <w:t xml:space="preserve">fully highlighting </w:t>
+      </w:r>
+      <w:r>
+        <w:rPr>
+          <w:sz w:val="24"/>
+        </w:rPr>
+        <w:t>its mission, vision and values as a brand.</w:t>
+      </w:r>
+      <w:r>
+        <w:rPr>
+          <w:sz w:val="24"/>
+        </w:rPr>
+        <w:t xml:space="preserve"> Also gives way for customers to explore </w:t>
+      </w:r>
+      <w:r>
+        <w:rPr>
+          <w:sz w:val="24"/>
+        </w:rPr>
+        <w:t xml:space="preserve">the fashion </w:t>
+      </w:r>
+      <w:r>
+        <w:rPr>
+          <w:sz w:val="24"/>
+        </w:rPr>
+        <w:t>collections</w:t>
+      </w:r>
+      <w:r>
+        <w:rPr>
+          <w:sz w:val="24"/>
+        </w:rPr>
+        <w:t>.</w:t>
+      </w:r>
+    </w:p>
+    <w:p>
+      <w:pPr>
+        <w:rPr>
+          <w:sz w:val="24"/>
+        </w:rPr>
+      </w:pPr>
+      <w:r>
+        <w:rPr>
+          <w:b/>
+          <w:bCs/>
+          <w:sz w:val="24"/>
+        </w:rPr>
+        <w:t>Catalogue</w:t>
+      </w:r>
+      <w:r>
+        <w:rPr>
+          <w:sz w:val="24"/>
+        </w:rPr>
+        <w:t xml:space="preserve">: Showcases the </w:t>
+      </w:r>
+      <w:r>
+        <w:rPr>
+          <w:sz w:val="24"/>
+        </w:rPr>
+        <w:t>products in their categories</w:t>
+      </w:r>
+      <w:r>
+        <w:rPr>
+          <w:sz w:val="24"/>
+        </w:rPr>
+        <w:t xml:space="preserve"> with</w:t>
+      </w:r>
+      <w:r>
+        <w:rPr>
+          <w:sz w:val="24"/>
+        </w:rPr>
+        <w:t xml:space="preserve"> full</w:t>
+      </w:r>
+      <w:r>
+        <w:rPr>
+          <w:sz w:val="24"/>
+        </w:rPr>
+        <w:t xml:space="preserve"> </w:t>
+      </w:r>
+      <w:r>
+        <w:rPr>
+          <w:sz w:val="24"/>
+        </w:rPr>
+        <w:t>descriptions</w:t>
+      </w:r>
+      <w:r>
+        <w:rPr>
+          <w:sz w:val="24"/>
+        </w:rPr>
+        <w:t xml:space="preserve"> as well as </w:t>
+      </w:r>
+      <w:r>
+        <w:rPr>
+          <w:sz w:val="24"/>
+        </w:rPr>
+        <w:t xml:space="preserve">prices. It also gives customers </w:t>
+      </w:r>
+      <w:r>
+        <w:rPr>
+          <w:sz w:val="24"/>
+        </w:rPr>
+        <w:t>the path to shop and add products to their cart.</w:t>
+      </w:r>
+    </w:p>
+    <w:p>
+      <w:pPr>
+        <w:rPr>
+          <w:sz w:val="24"/>
+        </w:rPr>
+      </w:pPr>
+      <w:r>
+        <w:rPr>
+          <w:b/>
+          <w:bCs/>
+          <w:sz w:val="24"/>
+        </w:rPr>
+        <w:t>Contact</w:t>
+      </w:r>
+      <w:r>
+        <w:rPr>
+          <w:sz w:val="24"/>
+        </w:rPr>
+        <w:t>:</w:t>
+      </w:r>
+      <w:r>
+        <w:rPr>
+          <w:sz w:val="24"/>
+        </w:rPr>
+        <w:t xml:space="preserve"> The page</w:t>
+      </w:r>
+      <w:r>
+        <w:rPr>
+          <w:sz w:val="24"/>
+        </w:rPr>
+        <w:t xml:space="preserve"> provides customers </w:t>
+      </w:r>
+      <w:r>
+        <w:rPr>
+          <w:sz w:val="24"/>
+        </w:rPr>
+        <w:t>with information about the website.</w:t>
+      </w:r>
+      <w:r>
+        <w:rPr>
+          <w:sz w:val="24"/>
+        </w:rPr>
+        <w:t xml:space="preserve"> It </w:t>
+      </w:r>
+      <w:r>
+        <w:rPr>
+          <w:sz w:val="24"/>
+        </w:rPr>
+        <w:t xml:space="preserve">also </w:t>
+      </w:r>
+      <w:r>
+        <w:rPr>
+          <w:sz w:val="24"/>
+        </w:rPr>
+        <w:t xml:space="preserve">has </w:t>
+      </w:r>
+      <w:r>
+        <w:rPr>
+          <w:sz w:val="24"/>
+        </w:rPr>
+        <w:t xml:space="preserve">contact </w:t>
+      </w:r>
+      <w:r>
+        <w:rPr>
+          <w:sz w:val="24"/>
+        </w:rPr>
+        <w:t>details, location</w:t>
+      </w:r>
+      <w:r>
+        <w:rPr>
+          <w:sz w:val="24"/>
+        </w:rPr>
+        <w:t xml:space="preserve"> as well as </w:t>
+      </w:r>
+      <w:r>
+        <w:rPr>
+          <w:sz w:val="24"/>
+        </w:rPr>
+        <w:t>links to the social</w:t>
+      </w:r>
+      <w:r>
+        <w:rPr>
+          <w:sz w:val="24"/>
+        </w:rPr>
+        <w:t xml:space="preserve"> media</w:t>
+      </w:r>
+      <w:r>
+        <w:rPr>
+          <w:sz w:val="24"/>
+        </w:rPr>
+        <w:t xml:space="preserve"> </w:t>
+      </w:r>
+      <w:r>
+        <w:rPr>
+          <w:sz w:val="24"/>
+        </w:rPr>
+        <w:t>platforms of the website</w:t>
+      </w:r>
+      <w:r>
+        <w:rPr>
+          <w:sz w:val="24"/>
+        </w:rPr>
+        <w:t>.</w:t>
+      </w:r>
+    </w:p>
+    <w:p>
+      <w:pPr>
+        <w:ind w:left="720" w:hanging="720"/>
+        <w:jc w:val="both"/>
+        <w:rPr>
+          <w:sz w:val="24"/>
+        </w:rPr>
+      </w:pPr>
+      <w:r>
+        <w:rPr>
+          <w:b/>
+          <w:bCs/>
+          <w:sz w:val="24"/>
+        </w:rPr>
+        <w:t>Feedback</w:t>
+      </w:r>
+      <w:r>
+        <w:rPr>
+          <w:sz w:val="24"/>
+        </w:rPr>
+        <w:t>:</w:t>
+      </w:r>
+      <w:r>
+        <w:rPr>
+          <w:sz w:val="24"/>
+        </w:rPr>
+        <w:t xml:space="preserve"> Allows customers to give feedback</w:t>
+      </w:r>
+      <w:r>
+        <w:rPr>
+          <w:sz w:val="24"/>
+        </w:rPr>
+        <w:t xml:space="preserve"> and review</w:t>
+      </w:r>
+      <w:r>
+        <w:rPr>
+          <w:sz w:val="24"/>
+        </w:rPr>
+        <w:t xml:space="preserve"> </w:t>
+      </w:r>
+      <w:r>
+        <w:rPr>
+          <w:sz w:val="24"/>
+        </w:rPr>
+        <w:t>products,</w:t>
+      </w:r>
+      <w:r>
+        <w:rPr>
+          <w:sz w:val="24"/>
+        </w:rPr>
+        <w:t xml:space="preserve"> helping</w:t>
+      </w:r>
+      <w:r>
+        <w:rPr>
+          <w:sz w:val="24"/>
+        </w:rPr>
+        <w:t xml:space="preserve"> </w:t>
+      </w:r>
+      <w:r>
+        <w:rPr>
+          <w:sz w:val="24"/>
+        </w:rPr>
+        <w:t>new users to</w:t>
+      </w:r>
+      <w:r>
+        <w:rPr>
+          <w:sz w:val="24"/>
+        </w:rPr>
+        <w:t xml:space="preserve"> see </w:t>
+      </w:r>
+      <w:r>
+        <w:rPr>
+          <w:sz w:val="24"/>
+        </w:rPr>
+        <w:t>and understand the website</w:t>
+      </w:r>
+      <w:r>
+        <w:rPr>
+          <w:sz w:val="24"/>
+        </w:rPr>
+        <w:t xml:space="preserve"> from other </w:t>
+      </w:r>
+      <w:r>
+        <w:rPr>
+          <w:sz w:val="24"/>
+        </w:rPr>
+        <w:t>customers’</w:t>
+      </w:r>
+      <w:r>
+        <w:rPr>
+          <w:sz w:val="24"/>
+        </w:rPr>
+        <w:t xml:space="preserve"> </w:t>
+      </w:r>
+      <w:r>
+        <w:rPr>
+          <w:sz w:val="24"/>
+        </w:rPr>
+        <w:t>perspective.</w:t>
+      </w:r>
+      <w:r>
+        <w:rPr>
+          <w:sz w:val="24"/>
+        </w:rPr>
+        <w:t xml:space="preserve"> </w:t>
+      </w:r>
+      <w:r>
+        <w:rPr>
+          <w:sz w:val="24"/>
+        </w:rPr>
+        <w:t xml:space="preserve">This also helps the brand owner to </w:t>
+      </w:r>
+      <w:r>
+        <w:rPr>
+          <w:sz w:val="24"/>
+        </w:rPr>
+        <w:t xml:space="preserve">make decisions </w:t>
+      </w:r>
+      <w:r>
+        <w:rPr>
+          <w:sz w:val="24"/>
+        </w:rPr>
+        <w:t>based on the feedback from customers</w:t>
+      </w:r>
+      <w:r>
+        <w:rPr>
+          <w:sz w:val="24"/>
+        </w:rPr>
+        <w:t xml:space="preserve"> and improve the brand</w:t>
+      </w:r>
+      <w:r>
+        <w:rPr>
+          <w:sz w:val="24"/>
+        </w:rPr>
+        <w:t>.</w:t>
+      </w:r>
+    </w:p>
+    <w:p>
+      <w:pPr>
+        <w:rPr>
+          <w:sz w:val="24"/>
+        </w:rPr>
+      </w:pPr>
+      <w:r>
+        <w:rPr>
+          <w:b/>
+          <w:bCs/>
+          <w:sz w:val="24"/>
+        </w:rPr>
+        <w:t xml:space="preserve">Profile: </w:t>
+      </w:r>
+      <w:r>
+        <w:rPr>
+          <w:sz w:val="24"/>
+        </w:rPr>
+        <w:t xml:space="preserve">This is where customers can view their account information and edit their profiles. They can navigate through their order history and manage their preferences </w:t>
+      </w:r>
+    </w:p>
+    <w:p>
+      <w:pPr>
+        <w:rPr>
+          <w:b/>
+          <w:bCs/>
+        </w:rPr>
+      </w:pPr>
+    </w:p>
+    <w:p>
+      <w:pPr>
+        <w:rPr>
+          <w:b/>
+          <w:bCs/>
+          <w:sz w:val="24"/>
+          <w:u w:val="single"/>
+        </w:rPr>
+      </w:pPr>
+      <w:r>
+        <w:rPr>
+          <w:b/>
+          <w:bCs/>
+          <w:sz w:val="24"/>
+          <w:u w:val="single"/>
+        </w:rPr>
+        <w:t>TECHNICAL BRIEF</w:t>
+      </w:r>
+    </w:p>
+    <w:p>
+      <w:pPr>
+        <w:pStyle w:val="ListParagraph"/>
+        <w:numPr>
+          <w:ilvl w:val="0"/>
+          <w:numId w:val="1"/>
+        </w:numPr>
+      </w:pPr>
+      <w:r>
+        <w:t>Html 5</w:t>
+      </w:r>
+    </w:p>
+    <w:p>
+      <w:pPr>
+        <w:pStyle w:val="ListParagraph"/>
+        <w:numPr>
+          <w:ilvl w:val="0"/>
+          <w:numId w:val="1"/>
+        </w:numPr>
+      </w:pPr>
+      <w:r>
+        <w:t>CSS</w:t>
+      </w:r>
+    </w:p>
+    <w:p>
+      <w:pPr>
+        <w:pStyle w:val="ListParagraph"/>
+        <w:numPr>
+          <w:ilvl w:val="0"/>
+          <w:numId w:val="1"/>
+        </w:numPr>
+      </w:pPr>
+      <w:r>
+        <w:t>JavaScript</w:t>
+      </w:r>
+    </w:p>
+    <w:p>
+      <w:pPr>
+        <w:pStyle w:val="ListParagraph"/>
+        <w:numPr>
+          <w:ilvl w:val="0"/>
+          <w:numId w:val="1"/>
+        </w:numPr>
+      </w:pPr>
+      <w:r>
+        <w:t>Bootstrap</w:t>
+      </w:r>
+    </w:p>
+    <w:p>
+      <w:pPr>
+        <w:pStyle w:val="ListParagraph"/>
+        <w:numPr>
+          <w:ilvl w:val="0"/>
+          <w:numId w:val="1"/>
+        </w:numPr>
+      </w:pPr>
+      <w:r>
+        <w:t>Microsoft Word</w:t>
+      </w:r>
+    </w:p>
+    <w:p>
+      <w:pPr>
+        <w:rPr>
+          <w:b/>
+          <w:bCs/>
+          <w:sz w:val="24"/>
+          <w:u w:val="single"/>
+        </w:rPr>
+      </w:pPr>
+      <w:r>
+        <w:rPr>
+          <w:b/>
+          <w:bCs/>
+          <w:sz w:val="24"/>
+          <w:u w:val="single"/>
+        </w:rPr>
+        <w:t>Tools</w:t>
+      </w:r>
+    </w:p>
+    <w:p>
+      <w:pPr>
+        <w:pStyle w:val="ListParagraph"/>
+        <w:numPr>
+          <w:ilvl w:val="0"/>
+          <w:numId w:val="2"/>
+        </w:numPr>
+        <w:rPr>
+          <w:sz w:val="32"/>
+          <w:szCs w:val="32"/>
+        </w:rPr>
+      </w:pPr>
+      <w:r>
+        <w:rPr>
+          <w:szCs w:val="22"/>
+        </w:rPr>
+        <w:t>Canva</w:t>
+      </w:r>
+    </w:p>
+    <w:p>
+      <w:pPr>
+        <w:pStyle w:val="ListParagraph"/>
+        <w:numPr>
+          <w:ilvl w:val="0"/>
+          <w:numId w:val="2"/>
+        </w:numPr>
+        <w:rPr>
+          <w:sz w:val="32"/>
+          <w:szCs w:val="32"/>
+        </w:rPr>
+      </w:pPr>
+      <w:r>
+        <w:rPr>
+          <w:szCs w:val="22"/>
+        </w:rPr>
+        <w:t>Figma</w:t>
+      </w:r>
+    </w:p>
+    <w:p>
+      <w:pPr>
+        <w:pStyle w:val="ListParagraph"/>
+        <w:numPr>
+          <w:ilvl w:val="0"/>
+          <w:numId w:val="2"/>
+        </w:numPr>
+        <w:rPr>
+          <w:sz w:val="32"/>
+          <w:szCs w:val="32"/>
+        </w:rPr>
+      </w:pPr>
+      <w:r>
+        <w:rPr>
+          <w:szCs w:val="22"/>
+        </w:rPr>
+        <w:t>VS Code</w:t>
+      </w:r>
+    </w:p>
+    <w:p>
+      <w:pPr>
+        <w:pStyle w:val="ListParagraph"/>
+        <w:numPr>
+          <w:ilvl w:val="0"/>
+          <w:numId w:val="2"/>
+        </w:numPr>
+        <w:rPr>
+          <w:sz w:val="32"/>
+          <w:szCs w:val="32"/>
+        </w:rPr>
+      </w:pPr>
+      <w:r>
+        <w:rPr>
+          <w:szCs w:val="22"/>
+        </w:rPr>
+        <w:lastRenderedPageBreak/>
+        <w:t>GitHub</w:t>
+      </w:r>
+    </w:p>
+    <w:p>
+      <w:pPr>
+        <w:pStyle w:val="ListParagraph"/>
+        <w:numPr>
+          <w:ilvl w:val="0"/>
+          <w:numId w:val="2"/>
+        </w:numPr>
+        <w:rPr>
+          <w:sz w:val="32"/>
+          <w:szCs w:val="32"/>
+        </w:rPr>
+      </w:pPr>
+      <w:r>
+        <w:rPr>
+          <w:szCs w:val="22"/>
+        </w:rPr>
+        <w:t>Git Pages</w:t>
+      </w:r>
+    </w:p>
+    <w:p>
+      <w:pPr>
+        <w:rPr>
+          <w:b/>
+          <w:bCs/>
+        </w:rPr>
+      </w:pPr>
+      <w:r>
+        <w:rPr>
+          <w:b/>
+          <w:bCs/>
+          <w:sz w:val="24"/>
+          <w:u w:val="single"/>
+        </w:rPr>
+        <w:t>PAGE TEMPLATE DESIGN</w:t>
+      </w:r>
+    </w:p>
+    <w:p>
+      <w:pPr>
+        <w:rPr>
+          <w:sz w:val="24"/>
+        </w:rPr>
+      </w:pPr>
+      <w:r>
+        <w:rPr>
+          <w:sz w:val="24"/>
+        </w:rPr>
+        <w:t>This is an overview of how Panda Paradise will look like once completed. It includes both high fidelity and low fidelity designs</w:t>
+      </w:r>
+      <w:r>
+        <w:rPr>
+          <w:sz w:val="24"/>
+        </w:rPr>
+        <w:t>.</w:t>
+      </w:r>
+    </w:p>
+    <w:p>
+      <w:pPr>
+        <w:rPr>
+          <w:b/>
+          <w:bCs/>
+          <w:sz w:val="24"/>
+        </w:rPr>
+      </w:pPr>
+      <w:r>
+        <w:rPr>
+          <w:b/>
+          <w:bCs/>
+          <w:sz w:val="24"/>
+        </w:rPr>
+        <w:t>LANDING PAGE</w:t>
+      </w:r>
+    </w:p>
+    <w:p>
+      <w:pPr>
+        <w:rPr>
+          <w:b/>
+          <w:bCs/>
+          <w:sz w:val="24"/>
+        </w:rPr>
+      </w:pPr>
+      <w:r>
+        <w:rPr>
+          <w:b/>
+          <w:bCs/>
+          <w:noProof/>
+          <w:sz w:val="24"/>
+        </w:rPr>
+        <w:drawing>
+          <wp:inline distT="0" distB="0" distL="0" distR="0" wp14:anchorId="2B3585E1" wp14:editId="504F4890">
+            <wp:extent cx="2661138" cy="2736054"/>
+            <wp:effectExtent l="0" t="0" r="6350" b="7620"/>
+            <wp:docPr id="105573347" name="Picture 4"/>
+            <wp:cNvGraphicFramePr>
+              <a:graphicFrameLocks xmlns:a="http://schemas.openxmlformats.org/drawingml/2006/main" noChangeAspect="1"/>
+            </wp:cNvGraphicFramePr>
+            <a:graphic xmlns:a="http://schemas.openxmlformats.org/drawingml/2006/main">
+              <a:graphicData uri="http://schemas.openxmlformats.org/drawingml/2006/picture">
+                <pic:pic xmlns:pic="http://schemas.openxmlformats.org/drawingml/2006/picture">
+                  <pic:nvPicPr>
+                    <pic:cNvPr id="105573347" name="Picture 105573347"/>
                     <pic:cNvPicPr/>
                   </pic:nvPicPr>
                   <pic:blipFill rotWithShape="1">
-                    <a:blip r:embed="rId7"/>
-                    <a:srcRect l="30286" t="20238" r="25592" b="34726"/>
+                    <a:blip r:embed="rId8" cstate="print">
+                      <a:extLst>
+                        <a:ext uri="{28A0092B-C50C-407E-A947-70E740481C1C}">
+                          <a14:useLocalDpi xmlns:a14="http://schemas.microsoft.com/office/drawing/2010/main" val="0"/>
+                        </a:ext>
+                      </a:extLst>
+                    </a:blip>
+                    <a:srcRect t="1278" b="1016"/>
                     <a:stretch>
                       <a:fillRect/>
                     </a:stretch>
@@ -1893,7 +2788,7 @@
                   <pic:spPr bwMode="auto">
                     <a:xfrm>
                       <a:off x="0" y="0"/>
-                      <a:ext cx="4648250" cy="2668478"/>
+                      <a:ext cx="2729428" cy="2806266"/>
                     </a:xfrm>
                     <a:prstGeom prst="rect">
                       <a:avLst/>
@@ -1913,881 +2808,69 @@
           </wp:inline>
         </w:drawing>
       </w:r>
-    </w:p>
-    <w:p>
-      <w:pPr>
-        <w:pStyle w:val="ListParagraph"/>
-        <w:rPr>
-          <w:b/>
-          <w:bCs/>
-        </w:rPr>
-      </w:pPr>
-    </w:p>
-    <w:p>
-      <w:pPr>
-        <w:pStyle w:val="ListParagraph"/>
-        <w:rPr>
-          <w:b/>
-          <w:bCs/>
-        </w:rPr>
-      </w:pPr>
-    </w:p>
-    <w:p>
-      <w:pPr>
-        <w:rPr>
-          <w:sz w:val="24"/>
-        </w:rPr>
-      </w:pPr>
-      <w:r>
-        <w:rPr>
-          <w:b/>
-          <w:bCs/>
-          <w:sz w:val="24"/>
-        </w:rPr>
-        <w:t>S</w:t>
-      </w:r>
-      <w:r>
-        <w:rPr>
-          <w:b/>
-          <w:bCs/>
-          <w:sz w:val="24"/>
-        </w:rPr>
-        <w:t>ign-up</w:t>
-      </w:r>
-      <w:r>
-        <w:rPr>
-          <w:sz w:val="24"/>
-        </w:rPr>
-        <w:t xml:space="preserve">: This page will require the customer to input their email address </w:t>
-      </w:r>
-      <w:r>
-        <w:rPr>
-          <w:sz w:val="24"/>
-        </w:rPr>
-        <w:t xml:space="preserve">or phone number </w:t>
-      </w:r>
-      <w:r>
-        <w:rPr>
-          <w:sz w:val="24"/>
-        </w:rPr>
-        <w:t>as well at the password</w:t>
-      </w:r>
-      <w:r>
-        <w:rPr>
-          <w:sz w:val="24"/>
-        </w:rPr>
-        <w:t xml:space="preserve"> to gain access to the website and utilize it.</w:t>
-      </w:r>
-    </w:p>
-    <w:p>
-      <w:pPr>
-        <w:rPr>
-          <w:sz w:val="24"/>
-        </w:rPr>
-      </w:pPr>
-      <w:r>
-        <w:rPr>
-          <w:b/>
-          <w:bCs/>
-          <w:sz w:val="24"/>
-        </w:rPr>
-        <w:lastRenderedPageBreak/>
-        <w:t>Log-in</w:t>
-      </w:r>
-      <w:r>
-        <w:rPr>
-          <w:sz w:val="24"/>
-        </w:rPr>
-        <w:t>:</w:t>
-      </w:r>
-      <w:r>
-        <w:rPr>
-          <w:sz w:val="24"/>
-        </w:rPr>
-        <w:t xml:space="preserve"> </w:t>
-      </w:r>
-      <w:r>
-        <w:rPr>
-          <w:sz w:val="24"/>
-        </w:rPr>
-        <w:t>It will authenticate</w:t>
-      </w:r>
-      <w:r>
-        <w:rPr>
-          <w:sz w:val="24"/>
-        </w:rPr>
-        <w:t xml:space="preserve"> by prompting users to input their details </w:t>
-      </w:r>
-      <w:r>
-        <w:rPr>
-          <w:sz w:val="24"/>
-        </w:rPr>
-        <w:t xml:space="preserve">so that only authorized people can </w:t>
-      </w:r>
-      <w:r>
-        <w:rPr>
-          <w:sz w:val="24"/>
-        </w:rPr>
-        <w:t>access their</w:t>
-      </w:r>
-      <w:r>
-        <w:rPr>
-          <w:sz w:val="24"/>
-        </w:rPr>
-        <w:t xml:space="preserve"> </w:t>
-      </w:r>
-      <w:r>
-        <w:rPr>
-          <w:sz w:val="24"/>
-        </w:rPr>
-        <w:t>accounts.</w:t>
-      </w:r>
-    </w:p>
-    <w:p>
-      <w:pPr>
-        <w:rPr>
-          <w:sz w:val="24"/>
-        </w:rPr>
-      </w:pPr>
-      <w:r>
-        <w:rPr>
-          <w:b/>
-          <w:bCs/>
-          <w:sz w:val="24"/>
-        </w:rPr>
-        <w:t>Home</w:t>
-      </w:r>
-      <w:r>
-        <w:rPr>
-          <w:sz w:val="24"/>
-        </w:rPr>
-        <w:t>:</w:t>
-      </w:r>
-      <w:r>
-        <w:rPr>
-          <w:sz w:val="24"/>
-        </w:rPr>
-        <w:t xml:space="preserve"> </w:t>
-      </w:r>
-      <w:r>
-        <w:rPr>
-          <w:sz w:val="24"/>
-        </w:rPr>
-        <w:t>T</w:t>
-      </w:r>
-      <w:r>
-        <w:rPr>
-          <w:sz w:val="24"/>
-        </w:rPr>
-        <w:t>he landing page has the welcoming message</w:t>
-      </w:r>
-      <w:r>
-        <w:rPr>
-          <w:sz w:val="24"/>
-        </w:rPr>
-        <w:t xml:space="preserve"> and a few products which have the </w:t>
-      </w:r>
-      <w:r>
-        <w:rPr>
-          <w:sz w:val="24"/>
-        </w:rPr>
-        <w:t xml:space="preserve">option </w:t>
-      </w:r>
-      <w:r>
-        <w:rPr>
-          <w:sz w:val="24"/>
-        </w:rPr>
-        <w:t xml:space="preserve">to shop now which leads to </w:t>
-      </w:r>
-      <w:r>
-        <w:rPr>
-          <w:sz w:val="24"/>
-        </w:rPr>
-        <w:t>catalogue. It also has the services provided by Panda Paradise</w:t>
-      </w:r>
-      <w:r>
-        <w:rPr>
-          <w:sz w:val="24"/>
-        </w:rPr>
-        <w:t xml:space="preserve"> and the footer containing </w:t>
-      </w:r>
-      <w:r>
-        <w:rPr>
-          <w:sz w:val="24"/>
-        </w:rPr>
-        <w:t xml:space="preserve">contact </w:t>
-      </w:r>
-      <w:r>
-        <w:rPr>
-          <w:sz w:val="24"/>
-        </w:rPr>
-        <w:t>information, location</w:t>
-      </w:r>
-      <w:r>
-        <w:rPr>
-          <w:sz w:val="24"/>
-        </w:rPr>
-        <w:t xml:space="preserve"> and social media </w:t>
-      </w:r>
-      <w:r>
-        <w:rPr>
-          <w:sz w:val="24"/>
-        </w:rPr>
-        <w:t>platforms. It also has all navigation.</w:t>
-      </w:r>
-    </w:p>
-    <w:p>
-      <w:pPr>
-        <w:rPr>
-          <w:sz w:val="24"/>
-        </w:rPr>
-      </w:pPr>
-      <w:r>
-        <w:rPr>
-          <w:b/>
-          <w:bCs/>
-          <w:sz w:val="24"/>
-        </w:rPr>
-        <w:t>About</w:t>
-      </w:r>
-      <w:r>
-        <w:rPr>
-          <w:sz w:val="24"/>
-        </w:rPr>
-        <w:t xml:space="preserve">: It </w:t>
-      </w:r>
-      <w:r>
-        <w:rPr>
-          <w:sz w:val="24"/>
-        </w:rPr>
-        <w:t xml:space="preserve">shows the </w:t>
-      </w:r>
-      <w:r>
-        <w:rPr>
-          <w:sz w:val="24"/>
-        </w:rPr>
-        <w:t xml:space="preserve">story of Panda Paradise </w:t>
-      </w:r>
-      <w:r>
-        <w:rPr>
-          <w:sz w:val="24"/>
-        </w:rPr>
-        <w:t xml:space="preserve">fully highlighting </w:t>
-      </w:r>
-      <w:r>
-        <w:rPr>
-          <w:sz w:val="24"/>
-        </w:rPr>
-        <w:t>its mission, vision and values as a brand.</w:t>
-      </w:r>
-      <w:r>
-        <w:rPr>
-          <w:sz w:val="24"/>
-        </w:rPr>
-        <w:t xml:space="preserve"> Also gives way for customers to explore </w:t>
-      </w:r>
-      <w:r>
-        <w:rPr>
-          <w:sz w:val="24"/>
-        </w:rPr>
-        <w:t xml:space="preserve">the fashion </w:t>
-      </w:r>
-      <w:r>
-        <w:rPr>
-          <w:sz w:val="24"/>
-        </w:rPr>
-        <w:t>collections</w:t>
-      </w:r>
-      <w:r>
-        <w:rPr>
-          <w:sz w:val="24"/>
-        </w:rPr>
-        <w:t>.</w:t>
-      </w:r>
-    </w:p>
-    <w:p>
-      <w:pPr>
-        <w:rPr>
-          <w:sz w:val="24"/>
-        </w:rPr>
-      </w:pPr>
-      <w:r>
-        <w:rPr>
-          <w:b/>
-          <w:bCs/>
-          <w:sz w:val="24"/>
-        </w:rPr>
-        <w:t>Catalogue</w:t>
-      </w:r>
-      <w:r>
-        <w:rPr>
-          <w:sz w:val="24"/>
-        </w:rPr>
-        <w:t xml:space="preserve">: Showcases the </w:t>
-      </w:r>
-      <w:r>
-        <w:rPr>
-          <w:sz w:val="24"/>
-        </w:rPr>
-        <w:t>products in their categories</w:t>
-      </w:r>
-      <w:r>
-        <w:rPr>
-          <w:sz w:val="24"/>
-        </w:rPr>
-        <w:t xml:space="preserve"> with</w:t>
-      </w:r>
-      <w:r>
-        <w:rPr>
-          <w:sz w:val="24"/>
-        </w:rPr>
-        <w:t xml:space="preserve"> full</w:t>
-      </w:r>
-      <w:r>
-        <w:rPr>
-          <w:sz w:val="24"/>
-        </w:rPr>
-        <w:t xml:space="preserve"> </w:t>
-      </w:r>
-      <w:r>
-        <w:rPr>
-          <w:sz w:val="24"/>
-        </w:rPr>
-        <w:t>descriptions</w:t>
-      </w:r>
-      <w:r>
-        <w:rPr>
-          <w:sz w:val="24"/>
-        </w:rPr>
-        <w:t xml:space="preserve"> as well as </w:t>
-      </w:r>
-      <w:r>
-        <w:rPr>
-          <w:sz w:val="24"/>
-        </w:rPr>
-        <w:t xml:space="preserve">prices. It also gives customers </w:t>
-      </w:r>
-      <w:r>
-        <w:rPr>
-          <w:sz w:val="24"/>
-        </w:rPr>
-        <w:t>the path to shop and add products to their cart.</w:t>
-      </w:r>
-    </w:p>
-    <w:p>
-      <w:pPr>
-        <w:rPr>
-          <w:sz w:val="24"/>
-        </w:rPr>
-      </w:pPr>
-      <w:r>
-        <w:rPr>
-          <w:b/>
-          <w:bCs/>
-          <w:sz w:val="24"/>
-        </w:rPr>
-        <w:t>Contact</w:t>
-      </w:r>
-      <w:r>
-        <w:rPr>
-          <w:sz w:val="24"/>
-        </w:rPr>
-        <w:t>:</w:t>
-      </w:r>
-      <w:r>
-        <w:rPr>
-          <w:sz w:val="24"/>
-        </w:rPr>
-        <w:t xml:space="preserve"> The page</w:t>
-      </w:r>
-      <w:r>
-        <w:rPr>
-          <w:sz w:val="24"/>
-        </w:rPr>
-        <w:t xml:space="preserve"> provides customers </w:t>
-      </w:r>
-      <w:r>
-        <w:rPr>
-          <w:sz w:val="24"/>
-        </w:rPr>
-        <w:t>with information about the website.</w:t>
-      </w:r>
-      <w:r>
-        <w:rPr>
-          <w:sz w:val="24"/>
-        </w:rPr>
-        <w:t xml:space="preserve"> It </w:t>
-      </w:r>
-      <w:r>
-        <w:rPr>
-          <w:sz w:val="24"/>
-        </w:rPr>
-        <w:t xml:space="preserve">also </w:t>
-      </w:r>
-      <w:r>
-        <w:rPr>
-          <w:sz w:val="24"/>
-        </w:rPr>
-        <w:t xml:space="preserve">has </w:t>
-      </w:r>
-      <w:r>
-        <w:rPr>
-          <w:sz w:val="24"/>
-        </w:rPr>
-        <w:t xml:space="preserve">contact </w:t>
-      </w:r>
-      <w:r>
-        <w:rPr>
-          <w:sz w:val="24"/>
-        </w:rPr>
-        <w:t>details, location</w:t>
-      </w:r>
-      <w:r>
-        <w:rPr>
-          <w:sz w:val="24"/>
-        </w:rPr>
-        <w:t xml:space="preserve"> as well as </w:t>
-      </w:r>
-      <w:r>
-        <w:rPr>
-          <w:sz w:val="24"/>
-        </w:rPr>
-        <w:t>links to the social</w:t>
-      </w:r>
-      <w:r>
-        <w:rPr>
-          <w:sz w:val="24"/>
-        </w:rPr>
-        <w:t xml:space="preserve"> media</w:t>
-      </w:r>
-      <w:r>
-        <w:rPr>
-          <w:sz w:val="24"/>
-        </w:rPr>
-        <w:t xml:space="preserve"> </w:t>
-      </w:r>
-      <w:r>
-        <w:rPr>
-          <w:sz w:val="24"/>
-        </w:rPr>
-        <w:t>platforms of the website</w:t>
-      </w:r>
-      <w:r>
-        <w:rPr>
-          <w:sz w:val="24"/>
-        </w:rPr>
-        <w:t>.</w:t>
-      </w:r>
-    </w:p>
-    <w:p>
-      <w:pPr>
-        <w:ind w:left="720" w:hanging="720"/>
-        <w:jc w:val="both"/>
-        <w:rPr>
-          <w:sz w:val="24"/>
-        </w:rPr>
-      </w:pPr>
-      <w:r>
-        <w:rPr>
-          <w:b/>
-          <w:bCs/>
-          <w:sz w:val="24"/>
-        </w:rPr>
-        <w:t>Feedback</w:t>
-      </w:r>
-      <w:r>
-        <w:rPr>
-          <w:sz w:val="24"/>
-        </w:rPr>
-        <w:t>:</w:t>
-      </w:r>
-      <w:r>
-        <w:rPr>
-          <w:sz w:val="24"/>
-        </w:rPr>
-        <w:t xml:space="preserve"> Allows customers to give feedback</w:t>
-      </w:r>
-      <w:r>
-        <w:rPr>
-          <w:sz w:val="24"/>
-        </w:rPr>
-        <w:t xml:space="preserve"> and review</w:t>
-      </w:r>
-      <w:r>
-        <w:rPr>
-          <w:sz w:val="24"/>
-        </w:rPr>
-        <w:t xml:space="preserve"> </w:t>
-      </w:r>
-      <w:r>
-        <w:rPr>
-          <w:sz w:val="24"/>
-        </w:rPr>
-        <w:t>products,</w:t>
-      </w:r>
-      <w:r>
-        <w:rPr>
-          <w:sz w:val="24"/>
-        </w:rPr>
-        <w:t xml:space="preserve"> helping</w:t>
-      </w:r>
-      <w:r>
-        <w:rPr>
-          <w:sz w:val="24"/>
-        </w:rPr>
-        <w:t xml:space="preserve"> </w:t>
-      </w:r>
-      <w:r>
-        <w:rPr>
-          <w:sz w:val="24"/>
-        </w:rPr>
-        <w:t>new users to</w:t>
-      </w:r>
-      <w:r>
-        <w:rPr>
-          <w:sz w:val="24"/>
-        </w:rPr>
-        <w:t xml:space="preserve"> see </w:t>
-      </w:r>
-      <w:r>
-        <w:rPr>
-          <w:sz w:val="24"/>
-        </w:rPr>
-        <w:t>and understand the website</w:t>
-      </w:r>
-      <w:r>
-        <w:rPr>
-          <w:sz w:val="24"/>
-        </w:rPr>
-        <w:t xml:space="preserve"> from other </w:t>
-      </w:r>
-      <w:r>
-        <w:rPr>
-          <w:sz w:val="24"/>
-        </w:rPr>
-        <w:t>customers’</w:t>
-      </w:r>
-      <w:r>
-        <w:rPr>
-          <w:sz w:val="24"/>
-        </w:rPr>
-        <w:t xml:space="preserve"> </w:t>
-      </w:r>
-      <w:r>
-        <w:rPr>
-          <w:sz w:val="24"/>
-        </w:rPr>
-        <w:t>perspective.</w:t>
-      </w:r>
-      <w:r>
-        <w:rPr>
-          <w:sz w:val="24"/>
-        </w:rPr>
-        <w:t xml:space="preserve"> </w:t>
-      </w:r>
-      <w:r>
-        <w:rPr>
-          <w:sz w:val="24"/>
-        </w:rPr>
-        <w:t xml:space="preserve">This also helps the brand owner to </w:t>
-      </w:r>
-      <w:r>
-        <w:rPr>
-          <w:sz w:val="24"/>
-        </w:rPr>
-        <w:t xml:space="preserve">make decisions </w:t>
-      </w:r>
-      <w:r>
-        <w:rPr>
-          <w:sz w:val="24"/>
-        </w:rPr>
-        <w:t>based on the feedback from customers</w:t>
-      </w:r>
-      <w:r>
-        <w:rPr>
-          <w:sz w:val="24"/>
-        </w:rPr>
-        <w:t xml:space="preserve"> and improve the brand</w:t>
-      </w:r>
-      <w:r>
-        <w:rPr>
-          <w:sz w:val="24"/>
-        </w:rPr>
-        <w:t>.</w:t>
-      </w:r>
-    </w:p>
-    <w:p>
-      <w:pPr>
-        <w:rPr>
-          <w:sz w:val="24"/>
-        </w:rPr>
-      </w:pPr>
-      <w:r>
-        <w:rPr>
-          <w:b/>
-          <w:bCs/>
-          <w:sz w:val="24"/>
-        </w:rPr>
-        <w:t xml:space="preserve">Profile: </w:t>
-      </w:r>
-      <w:r>
-        <w:rPr>
-          <w:sz w:val="24"/>
-        </w:rPr>
-        <w:t xml:space="preserve">This is where customers can view their account information and edit their profiles. They can navigate through their order history and manage their preferences </w:t>
-      </w:r>
-    </w:p>
-    <w:p>
-      <w:pPr>
-        <w:rPr>
-          <w:b/>
-          <w:bCs/>
-        </w:rPr>
-      </w:pPr>
-    </w:p>
-    <w:p>
-      <w:pPr>
-        <w:rPr>
-          <w:b/>
-          <w:bCs/>
-          <w:sz w:val="24"/>
-          <w:u w:val="single"/>
-        </w:rPr>
-      </w:pPr>
-      <w:r>
-        <w:rPr>
-          <w:b/>
-          <w:bCs/>
-          <w:sz w:val="24"/>
-          <w:u w:val="single"/>
-        </w:rPr>
-        <w:t>TECHNICAL BRIEF</w:t>
-      </w:r>
-    </w:p>
-    <w:p>
-      <w:pPr>
-        <w:pStyle w:val="ListParagraph"/>
-        <w:numPr>
-          <w:ilvl w:val="0"/>
-          <w:numId w:val="1"/>
-        </w:numPr>
-      </w:pPr>
-      <w:r>
-        <w:t>Html 5</w:t>
-      </w:r>
-    </w:p>
-    <w:p>
-      <w:pPr>
-        <w:pStyle w:val="ListParagraph"/>
-        <w:numPr>
-          <w:ilvl w:val="0"/>
-          <w:numId w:val="1"/>
-        </w:numPr>
-      </w:pPr>
-      <w:r>
-        <w:t>CSS</w:t>
-      </w:r>
-    </w:p>
-    <w:p>
-      <w:pPr>
-        <w:pStyle w:val="ListParagraph"/>
-        <w:numPr>
-          <w:ilvl w:val="0"/>
-          <w:numId w:val="1"/>
-        </w:numPr>
-      </w:pPr>
-      <w:r>
-        <w:t>JavaScript</w:t>
-      </w:r>
-    </w:p>
-    <w:p>
-      <w:pPr>
-        <w:pStyle w:val="ListParagraph"/>
-        <w:numPr>
-          <w:ilvl w:val="0"/>
-          <w:numId w:val="1"/>
-        </w:numPr>
-      </w:pPr>
-      <w:r>
-        <w:t>Bootstrap</w:t>
-      </w:r>
-    </w:p>
-    <w:p>
-      <w:pPr>
-        <w:pStyle w:val="ListParagraph"/>
-        <w:numPr>
-          <w:ilvl w:val="0"/>
-          <w:numId w:val="1"/>
-        </w:numPr>
-      </w:pPr>
-      <w:r>
-        <w:t>Microsoft Word</w:t>
-      </w:r>
-    </w:p>
-    <w:p>
-      <w:pPr>
-        <w:rPr>
-          <w:b/>
-          <w:bCs/>
-          <w:sz w:val="24"/>
-          <w:u w:val="single"/>
-        </w:rPr>
-      </w:pPr>
-      <w:r>
-        <w:rPr>
-          <w:b/>
-          <w:bCs/>
-          <w:sz w:val="24"/>
-          <w:u w:val="single"/>
-        </w:rPr>
-        <w:t>Tools</w:t>
-      </w:r>
-    </w:p>
-    <w:p>
-      <w:pPr>
-        <w:pStyle w:val="ListParagraph"/>
-        <w:numPr>
-          <w:ilvl w:val="0"/>
-          <w:numId w:val="2"/>
-        </w:numPr>
-        <w:rPr>
-          <w:sz w:val="32"/>
-          <w:szCs w:val="32"/>
-        </w:rPr>
-      </w:pPr>
-      <w:r>
-        <w:rPr>
-          <w:szCs w:val="22"/>
-        </w:rPr>
-        <w:t>Canva</w:t>
-      </w:r>
-    </w:p>
-    <w:p>
-      <w:pPr>
-        <w:pStyle w:val="ListParagraph"/>
-        <w:numPr>
-          <w:ilvl w:val="0"/>
-          <w:numId w:val="2"/>
-        </w:numPr>
-        <w:rPr>
-          <w:sz w:val="32"/>
-          <w:szCs w:val="32"/>
-        </w:rPr>
-      </w:pPr>
-      <w:r>
-        <w:rPr>
-          <w:szCs w:val="22"/>
-        </w:rPr>
-        <w:t>Figma</w:t>
-      </w:r>
-    </w:p>
-    <w:p>
-      <w:pPr>
-        <w:pStyle w:val="ListParagraph"/>
-        <w:numPr>
-          <w:ilvl w:val="0"/>
-          <w:numId w:val="2"/>
-        </w:numPr>
-        <w:rPr>
-          <w:sz w:val="32"/>
-          <w:szCs w:val="32"/>
-        </w:rPr>
-      </w:pPr>
-      <w:r>
-        <w:rPr>
-          <w:szCs w:val="22"/>
-        </w:rPr>
-        <w:t>VS Code</w:t>
-      </w:r>
-    </w:p>
-    <w:p>
-      <w:pPr>
-        <w:pStyle w:val="ListParagraph"/>
-        <w:numPr>
-          <w:ilvl w:val="0"/>
-          <w:numId w:val="2"/>
-        </w:numPr>
-        <w:rPr>
-          <w:sz w:val="32"/>
-          <w:szCs w:val="32"/>
-        </w:rPr>
-      </w:pPr>
-      <w:r>
-        <w:rPr>
-          <w:szCs w:val="22"/>
-        </w:rPr>
-        <w:t>GitHub</w:t>
-      </w:r>
-    </w:p>
-    <w:p>
-      <w:pPr>
-        <w:pStyle w:val="ListParagraph"/>
-        <w:numPr>
-          <w:ilvl w:val="0"/>
-          <w:numId w:val="2"/>
-        </w:numPr>
-        <w:rPr>
-          <w:sz w:val="32"/>
-          <w:szCs w:val="32"/>
-        </w:rPr>
-      </w:pPr>
-      <w:r>
-        <w:rPr>
-          <w:szCs w:val="22"/>
-        </w:rPr>
-        <w:t>Git Pages</w:t>
-      </w:r>
-    </w:p>
-    <w:p>
-      <w:pPr>
-        <w:ind w:left="360"/>
-        <w:rPr>
-          <w:b/>
-          <w:bCs/>
-        </w:rPr>
-      </w:pPr>
-      <w:r>
-        <w:rPr>
-          <w:b/>
-          <w:bCs/>
-        </w:rPr>
-        <w:t xml:space="preserve">        </w:t>
-      </w:r>
-    </w:p>
-    <w:p>
-      <w:pPr>
-        <w:rPr>
-          <w:sz w:val="24"/>
-        </w:rPr>
-      </w:pPr>
-      <w:r>
-        <w:rPr>
-          <w:b/>
-          <w:bCs/>
-          <w:sz w:val="24"/>
-          <w:u w:val="single"/>
-        </w:rPr>
-        <w:t>PAGE TEMPLATE DESIGN</w:t>
-      </w:r>
-    </w:p>
-    <w:p>
-      <w:pPr>
-        <w:rPr>
-          <w:sz w:val="24"/>
-        </w:rPr>
-      </w:pPr>
-      <w:r>
-        <w:rPr>
-          <w:sz w:val="24"/>
-        </w:rPr>
-        <w:lastRenderedPageBreak/>
-        <w:t>This is an overview of how Panda Paradise will look like once completed. It includes both high fidelity and low fidelity designs</w:t>
-      </w:r>
-      <w:r>
-        <w:rPr>
-          <w:sz w:val="24"/>
-        </w:rPr>
-        <w:t>.</w:t>
+      <w:r>
+        <w:rPr>
+          <w:b/>
+          <w:bCs/>
+          <w:sz w:val="24"/>
+        </w:rPr>
+        <w:drawing>
+          <wp:anchor distT="0" distB="0" distL="114300" distR="114300" simplePos="0" relativeHeight="251658240" behindDoc="0" locked="0" layoutInCell="1" allowOverlap="1" wp14:anchorId="28715077" wp14:editId="518E986B">
+            <wp:simplePos x="914400" y="2667000"/>
+            <wp:positionH relativeFrom="column">
+              <wp:align>left</wp:align>
+            </wp:positionH>
+            <wp:positionV relativeFrom="paragraph">
+              <wp:align>top</wp:align>
+            </wp:positionV>
+            <wp:extent cx="2788920" cy="2840638"/>
+            <wp:effectExtent l="0" t="0" r="0" b="0"/>
+            <wp:wrapSquare wrapText="bothSides"/>
+            <wp:docPr id="1735498336" name="Picture 1"/>
+            <wp:cNvGraphicFramePr>
+              <a:graphicFrameLocks xmlns:a="http://schemas.openxmlformats.org/drawingml/2006/main" noChangeAspect="1"/>
+            </wp:cNvGraphicFramePr>
+            <a:graphic xmlns:a="http://schemas.openxmlformats.org/drawingml/2006/main">
+              <a:graphicData uri="http://schemas.openxmlformats.org/drawingml/2006/picture">
+                <pic:pic xmlns:pic="http://schemas.openxmlformats.org/drawingml/2006/picture">
+                  <pic:nvPicPr>
+                    <pic:cNvPr id="1735498336" name=""/>
+                    <pic:cNvPicPr/>
+                  </pic:nvPicPr>
+                  <pic:blipFill>
+                    <a:blip r:embed="rId9" cstate="print">
+                      <a:extLst>
+                        <a:ext uri="{28A0092B-C50C-407E-A947-70E740481C1C}">
+                          <a14:useLocalDpi xmlns:a14="http://schemas.microsoft.com/office/drawing/2010/main" val="0"/>
+                        </a:ext>
+                      </a:extLst>
+                    </a:blip>
+                    <a:stretch>
+                      <a:fillRect/>
+                    </a:stretch>
+                  </pic:blipFill>
+                  <pic:spPr>
+                    <a:xfrm>
+                      <a:off x="0" y="0"/>
+                      <a:ext cx="2788920" cy="2840638"/>
+                    </a:xfrm>
+                    <a:prstGeom prst="rect">
+                      <a:avLst/>
+                    </a:prstGeom>
+                  </pic:spPr>
+                </pic:pic>
+              </a:graphicData>
+            </a:graphic>
+          </wp:anchor>
+        </w:drawing>
+      </w:r>
+      <w:r>
+        <w:rPr>
+          <w:b/>
+          <w:bCs/>
+          <w:sz w:val="24"/>
+        </w:rPr>
+        <w:br w:type="textWrapping" w:clear="all"/>
       </w:r>
     </w:p>
     <w:p>
@@ -2808,29 +2891,21 @@
         </w:rPr>
         <w:t>HOME PAGE</w:t>
       </w:r>
-      <w:r>
+    </w:p>
+    <w:p>
+      <w:pPr>
         <w:rPr>
           <w:b/>
           <w:bCs/>
           <w:sz w:val="24"/>
           <w:lang w:val="en-BW"/>
         </w:rPr>
-        <w:t xml:space="preserve"> </w:t>
-      </w:r>
-    </w:p>
-    <w:p>
-      <w:pPr>
-        <w:rPr>
-          <w:b/>
-          <w:bCs/>
-          <w:sz w:val="24"/>
-          <w:lang w:val="en-BW"/>
-        </w:rPr>
-      </w:pPr>
-      <w:r>
-        <w:rPr>
-          <w:b/>
-          <w:bCs/>
+      </w:pPr>
+      <w:r>
+        <w:rPr>
+          <w:b/>
+          <w:bCs/>
+          <w:noProof/>
           <w:sz w:val="24"/>
           <w:lang w:val="en-BW"/>
         </w:rPr>
@@ -2850,7 +2925,7 @@
                     <pic:cNvPicPr/>
                   </pic:nvPicPr>
                   <pic:blipFill rotWithShape="1">
-                    <a:blip r:embed="rId8"/>
+                    <a:blip r:embed="rId10"/>
                     <a:srcRect l="20089" t="18649" r="16686" b="24868"/>
                     <a:stretch>
                       <a:fillRect/>
@@ -2896,6 +2971,7 @@
           <w:sz w:val="24"/>
           <w:lang w:val="en-BW"/>
         </w:rPr>
+        <w:lastRenderedPageBreak/>
         <w:t>LOGIN</w:t>
       </w:r>
     </w:p>
@@ -2912,6 +2988,7 @@
         <w:rPr>
           <w:b/>
           <w:bCs/>
+          <w:noProof/>
           <w:sz w:val="24"/>
           <w:lang w:val="en-BW"/>
         </w:rPr>
@@ -2931,7 +3008,7 @@
                     <pic:cNvPicPr/>
                   </pic:nvPicPr>
                   <pic:blipFill rotWithShape="1">
-                    <a:blip r:embed="rId9"/>
+                    <a:blip r:embed="rId11"/>
                     <a:srcRect l="23651" t="11261" r="23613" b="31915"/>
                     <a:stretch>
                       <a:fillRect/>
@@ -2997,7 +3074,6 @@
           <w:sz w:val="24"/>
           <w:lang w:val="en-BW"/>
         </w:rPr>
-        <w:lastRenderedPageBreak/>
         <w:t>SIGN UP</w:t>
       </w:r>
     </w:p>
@@ -3014,6 +3090,7 @@
         <w:rPr>
           <w:b/>
           <w:bCs/>
+          <w:noProof/>
           <w:sz w:val="24"/>
           <w:lang w:val="en-BW"/>
         </w:rPr>
@@ -3033,7 +3110,7 @@
                     <pic:cNvPicPr/>
                   </pic:nvPicPr>
                   <pic:blipFill rotWithShape="1">
-                    <a:blip r:embed="rId10"/>
+                    <a:blip r:embed="rId12"/>
                     <a:srcRect l="23651" t="10383" r="24701" b="33482"/>
                     <a:stretch>
                       <a:fillRect/>
@@ -3077,6 +3154,7 @@
           <w:sz w:val="24"/>
           <w:lang w:val="en-BW"/>
         </w:rPr>
+        <w:lastRenderedPageBreak/>
         <w:t>ABOUT US</w:t>
       </w:r>
       <w:r>
@@ -3098,6 +3176,7 @@
       </w:pPr>
       <w:r>
         <w:rPr>
+          <w:noProof/>
           <w:sz w:val="24"/>
           <w:lang w:val="en-BW"/>
         </w:rPr>
@@ -3117,7 +3196,7 @@
                     <pic:cNvPicPr/>
                   </pic:nvPicPr>
                   <pic:blipFill rotWithShape="1">
-                    <a:blip r:embed="rId11"/>
+                    <a:blip r:embed="rId13"/>
                     <a:srcRect l="21078" t="12849" r="16884" b="29964"/>
                     <a:stretch>
                       <a:fillRect/>
@@ -3156,56 +3235,26 @@
           <w:lang w:val="en-BW"/>
         </w:rPr>
       </w:pPr>
-    </w:p>
-    <w:p>
-      <w:pPr>
+      <w:r>
         <w:rPr>
           <w:b/>
           <w:bCs/>
           <w:sz w:val="24"/>
           <w:lang w:val="en-BW"/>
         </w:rPr>
-      </w:pPr>
-    </w:p>
-    <w:p>
-      <w:pPr>
-        <w:rPr>
-          <w:b/>
-          <w:bCs/>
+        <w:t>CATALOGUE</w:t>
+      </w:r>
+    </w:p>
+    <w:p>
+      <w:pPr>
+        <w:rPr>
           <w:sz w:val="24"/>
           <w:lang w:val="en-BW"/>
         </w:rPr>
       </w:pPr>
-    </w:p>
-    <w:p>
-      <w:pPr>
-        <w:rPr>
-          <w:b/>
-          <w:bCs/>
-          <w:sz w:val="24"/>
-          <w:lang w:val="en-BW"/>
-        </w:rPr>
-      </w:pPr>
-      <w:r>
-        <w:rPr>
-          <w:b/>
-          <w:bCs/>
-          <w:sz w:val="24"/>
-          <w:lang w:val="en-BW"/>
-        </w:rPr>
-        <w:lastRenderedPageBreak/>
-        <w:t>CATALOGUE</w:t>
-      </w:r>
-    </w:p>
-    <w:p>
-      <w:pPr>
-        <w:rPr>
-          <w:sz w:val="24"/>
-          <w:lang w:val="en-BW"/>
-        </w:rPr>
-      </w:pPr>
-      <w:r>
-        <w:rPr>
+      <w:r>
+        <w:rPr>
+          <w:noProof/>
           <w:sz w:val="24"/>
           <w:lang w:val="en-BW"/>
         </w:rPr>
@@ -3227,7 +3276,7 @@
                     </pic:cNvPicPr>
                   </pic:nvPicPr>
                   <pic:blipFill rotWithShape="1">
-                    <a:blip r:embed="rId12">
+                    <a:blip r:embed="rId14">
                       <a:extLst>
                         <a:ext uri="{28A0092B-C50C-407E-A947-70E740481C1C}">
                           <a14:useLocalDpi xmlns:a14="http://schemas.microsoft.com/office/drawing/2010/main" val="0"/>
@@ -3292,9 +3341,11 @@
       </w:pPr>
       <w:r>
         <w:rPr>
+          <w:noProof/>
           <w:sz w:val="24"/>
           <w:lang w:val="en-BW"/>
         </w:rPr>
+        <w:lastRenderedPageBreak/>
         <w:drawing>
           <wp:inline distT="0" distB="0" distL="0" distR="0" wp14:anchorId="2189643A" wp14:editId="245B7A63">
             <wp:extent cx="6582508" cy="3405919"/>
@@ -3311,7 +3362,7 @@
                     <pic:cNvPicPr/>
                   </pic:nvPicPr>
                   <pic:blipFill rotWithShape="1">
-                    <a:blip r:embed="rId13"/>
+                    <a:blip r:embed="rId15"/>
                     <a:srcRect l="24739" t="20587" r="17874" b="26619"/>
                     <a:stretch>
                       <a:fillRect/>
@@ -3399,6 +3450,7 @@
       </w:pPr>
       <w:r>
         <w:rPr>
+          <w:noProof/>
           <w:sz w:val="24"/>
           <w:lang w:val="en-BW"/>
         </w:rPr>
@@ -3418,7 +3470,7 @@
                     <pic:cNvPicPr/>
                   </pic:nvPicPr>
                   <pic:blipFill rotWithShape="1">
-                    <a:blip r:embed="rId14"/>
+                    <a:blip r:embed="rId16"/>
                     <a:srcRect l="22463" t="25514" r="17379" b="19931"/>
                     <a:stretch>
                       <a:fillRect/>
@@ -3457,39 +3509,31 @@
           <w:lang w:val="en-BW"/>
         </w:rPr>
       </w:pPr>
-    </w:p>
-    <w:p>
-      <w:pPr>
+      <w:r>
         <w:rPr>
           <w:b/>
           <w:bCs/>
           <w:sz w:val="24"/>
           <w:lang w:val="en-BW"/>
         </w:rPr>
-      </w:pPr>
-      <w:r>
+        <w:lastRenderedPageBreak/>
+        <w:t>PROFILE</w:t>
+      </w:r>
+    </w:p>
+    <w:p>
+      <w:pPr>
         <w:rPr>
           <w:b/>
           <w:bCs/>
           <w:sz w:val="24"/>
           <w:lang w:val="en-BW"/>
         </w:rPr>
-        <w:t>PROFILE</w:t>
-      </w:r>
-    </w:p>
-    <w:p>
-      <w:pPr>
-        <w:rPr>
-          <w:b/>
-          <w:bCs/>
-          <w:sz w:val="24"/>
-          <w:lang w:val="en-BW"/>
-        </w:rPr>
-      </w:pPr>
-      <w:r>
-        <w:rPr>
-          <w:b/>
-          <w:bCs/>
+      </w:pPr>
+      <w:r>
+        <w:rPr>
+          <w:b/>
+          <w:bCs/>
+          <w:noProof/>
           <w:sz w:val="24"/>
           <w:lang w:val="en-BW"/>
         </w:rPr>
@@ -3509,7 +3553,7 @@
                     <pic:cNvPicPr/>
                   </pic:nvPicPr>
                   <pic:blipFill rotWithShape="1">
-                    <a:blip r:embed="rId15"/>
+                    <a:blip r:embed="rId17"/>
                     <a:srcRect l="21375" t="17596" r="18171" b="26965"/>
                     <a:stretch>
                       <a:fillRect/>
@@ -3564,7 +3608,7 @@
         </w:rPr>
         <w:t>:</w:t>
       </w:r>
-      <w:hyperlink r:id="rId16" w:history="1">
+      <w:hyperlink r:id="rId18" w:history="1">
         <w:r>
           <w:rPr>
             <w:rStyle w:val="Hyperlink"/>
@@ -3592,7 +3636,7 @@
         </w:rPr>
         <w:t>Prototype link:</w:t>
       </w:r>
-      <w:hyperlink r:id="rId17" w:history="1">
+      <w:hyperlink r:id="rId19" w:history="1">
         <w:r>
           <w:rPr>
             <w:rStyle w:val="Hyperlink"/>
@@ -3996,9 +4040,9 @@
       </w:pPr>
     </w:p>
     <w:sectPr>
-      <w:headerReference w:type="even" r:id="rId18"/>
-      <w:headerReference w:type="default" r:id="rId19"/>
-      <w:headerReference w:type="first" r:id="rId20"/>
+      <w:headerReference w:type="even" r:id="rId20"/>
+      <w:headerReference w:type="default" r:id="rId21"/>
+      <w:headerReference w:type="first" r:id="rId22"/>
       <w:pgSz w:w="12240" w:h="15840"/>
       <w:pgMar w:top="1440" w:right="1471" w:bottom="1440" w:left="1440" w:header="763" w:footer="720" w:gutter="0"/>
       <w:cols w:space="720"/>
@@ -5243,6 +5287,7 @@
   <w:style w:type="character" w:default="1" w:styleId="DefaultParagraphFont">
     <w:name w:val="Default Paragraph Font"/>
     <w:uiPriority w:val="1"/>
+    <w:semiHidden/>
     <w:unhideWhenUsed/>
   </w:style>
   <w:style w:type="table" w:default="1" w:styleId="TableNormal">

</xml_diff>